<commit_message>
Apply Dr. Rey directive (2026-06-30): analysis scope = EFA + reliabilities only; n=100 valid; PAF + Direct Oblimin; item rule <.30 / .30-.40 case-by-case
- Authoritative directive record + reply email (decline meeting, accept EFA assignment)
- Updated README, PROGRESS_TRACKER, Milestones, Sprint, CloudResearch guide, codebook, paper Ch.3 conclusion
- Mediation/hypothesis testing reframed as future research; Jul 2 meeting cancelled

Co-Authored-By: Claude Opus 4.8 (1M context) <noreply@anthropic.com>
Claude-Session: https://claude.ai/code/session_019uQWfMoV11me5yJ6LYRtPv
</commit_message>
<xml_diff>
--- a/dba/Milestones_and_Timeline.docx
+++ b/dba/Milestones_and_Timeline.docx
@@ -202,16 +202,16 @@
         <w:t>M6</w:t>
       </w:r>
       <w:r>
-        <w:t xml:space="preserve"> | Methodology meeting w/ Dr. Rey | </w:t>
+        <w:t xml:space="preserve"> | Methodology questions to Dr. Rey | ✅ Jun 30 | </w:t>
       </w:r>
       <w:r>
         <w:rPr>
           <w:b/>
         </w:rPr>
-        <w:t>Thu Jul 2, 11:00 AM</w:t>
+        <w:t>Answered by email</w:t>
       </w:r>
       <w:r>
-        <w:t xml:space="preserve"> | 4 method questions answered (n floor, rotation, mediation inputs, cross-loading rule) |</w:t>
+        <w:t xml:space="preserve"> — n=100, PAF + Direct Oblimin, EFA+reliabilities only, item rule. Meeting declined per his recommendation to focus on collection. |</w:t>
       </w:r>
     </w:p>
     <w:p>
@@ -243,7 +243,16 @@
         <w:t>Wed Jul 8</w:t>
       </w:r>
       <w:r>
-        <w:t xml:space="preserve"> | n = 60–80 valid responses; collection closed; data exported |</w:t>
+        <w:t xml:space="preserve"> | </w:t>
+      </w:r>
+      <w:r>
+        <w:rPr>
+          <w:b/>
+        </w:rPr>
+        <w:t>n = 100 valid</w:t>
+      </w:r>
+      <w:r>
+        <w:t xml:space="preserve"> responses; collection closed; data exported |</w:t>
       </w:r>
     </w:p>
     <w:p>
@@ -277,24 +286,33 @@
         <w:rPr>
           <w:b/>
         </w:rPr>
-        <w:t>EFA + reliability complete</w:t>
+        <w:t>EFA + reliabilities complete (FINAL ANALYSIS)</w:t>
       </w:r>
       <w:r>
-        <w:t xml:space="preserve"> | Mon Jul 13 | KMO + Bartlett; PAF; parallel analysis; rotation; pattern matrix; α per factor |</w:t>
-      </w:r>
-    </w:p>
-    <w:p>
-      <w:r>
-        <w:t xml:space="preserve">| </w:t>
+        <w:t xml:space="preserve"> | Mon Jul 14 | KMO + Bartlett; PAF; parallel analysis; </w:t>
       </w:r>
       <w:r>
         <w:rPr>
           <w:b/>
         </w:rPr>
-        <w:t>M10</w:t>
+        <w:t>Direct Oblimin</w:t>
       </w:r>
       <w:r>
-        <w:t xml:space="preserve"> | Mediation complete | Tue Jul 14 | PROCESS Model 4, 5,000 bootstraps, AJQ/APR pathways |</w:t>
+        <w:t xml:space="preserve"> rotation; pattern matrix; item removal (&lt;.30; .30–.40 case-by-case); Cronbach's α per factor |</w:t>
+      </w:r>
+    </w:p>
+    <w:p>
+      <w:r>
+        <w:t xml:space="preserve">| ~~M10~~ | ~~Mediation~~ | — | </w:t>
+      </w:r>
+      <w:r>
+        <w:rPr>
+          <w:b/>
+        </w:rPr>
+        <w:t>Out of scope</w:t>
+      </w:r>
+      <w:r>
+        <w:t xml:space="preserve"> per advisor directive (no mediation/hypothesis testing this term) |</w:t>
       </w:r>
     </w:p>
     <w:p>

</xml_diff>